<commit_message>
new file:   seance_1/Toma/Galerie d'images pour le rapport/Affichage des MNT/3D/mnt_artificiel_3d.png
</commit_message>
<xml_diff>
--- a/seance_1/Toma/Projet_systèmes_Rapport.docx
+++ b/seance_1/Toma/Projet_systèmes_Rapport.docx
@@ -9,7 +9,7 @@
       <w:bookmarkStart w:id="0" w:name="_Toc219311780"/>
       <w:bookmarkStart w:id="1" w:name="_Toc221450650"/>
       <w:bookmarkStart w:id="2" w:name="_Toc226909609"/>
-      <w:bookmarkStart w:id="3" w:name="_Toc228026222"/>
+      <w:bookmarkStart w:id="3" w:name="_Toc231220321"/>
       <w:r>
         <w:rPr>
           <w:noProof/>
@@ -1258,7 +1258,7 @@
       <w:pPr>
         <w:pStyle w:val="Titre1"/>
       </w:pPr>
-      <w:bookmarkStart w:id="4" w:name="_Toc228026223"/>
+      <w:bookmarkStart w:id="4" w:name="_Toc231220322"/>
       <w:r>
         <w:t>Remerciements</w:t>
       </w:r>
@@ -1542,7 +1542,7 @@
             </w:rPr>
             <w:fldChar w:fldCharType="separate"/>
           </w:r>
-          <w:hyperlink w:anchor="_Toc228026222" w:history="1">
+          <w:hyperlink w:anchor="_Toc231220321" w:history="1">
             <w:r>
               <w:rPr>
                 <w:noProof/>
@@ -1562,7 +1562,7 @@
                 <w:noProof/>
                 <w:webHidden/>
               </w:rPr>
-              <w:instrText xml:space="preserve"> PAGEREF _Toc228026222 \h </w:instrText>
+              <w:instrText xml:space="preserve"> PAGEREF _Toc231220321 \h </w:instrText>
             </w:r>
             <w:r>
               <w:rPr>
@@ -1609,7 +1609,7 @@
               <w14:ligatures w14:val="standardContextual"/>
             </w:rPr>
           </w:pPr>
-          <w:hyperlink w:anchor="_Toc228026223" w:history="1">
+          <w:hyperlink w:anchor="_Toc231220322" w:history="1">
             <w:r>
               <w:rPr>
                 <w:rStyle w:val="Lienhypertexte"/>
@@ -1636,7 +1636,7 @@
                 <w:noProof/>
                 <w:webHidden/>
               </w:rPr>
-              <w:instrText xml:space="preserve"> PAGEREF _Toc228026223 \h </w:instrText>
+              <w:instrText xml:space="preserve"> PAGEREF _Toc231220322 \h </w:instrText>
             </w:r>
             <w:r>
               <w:rPr>
@@ -1683,7 +1683,7 @@
               <w14:ligatures w14:val="standardContextual"/>
             </w:rPr>
           </w:pPr>
-          <w:hyperlink w:anchor="_Toc228026224" w:history="1">
+          <w:hyperlink w:anchor="_Toc231220323" w:history="1">
             <w:r>
               <w:rPr>
                 <w:rStyle w:val="Lienhypertexte"/>
@@ -1710,7 +1710,7 @@
                 <w:noProof/>
                 <w:webHidden/>
               </w:rPr>
-              <w:instrText xml:space="preserve"> PAGEREF _Toc228026224 \h </w:instrText>
+              <w:instrText xml:space="preserve"> PAGEREF _Toc231220323 \h </w:instrText>
             </w:r>
             <w:r>
               <w:rPr>
@@ -1730,7 +1730,7 @@
                 <w:noProof/>
                 <w:webHidden/>
               </w:rPr>
-              <w:t>4</w:t>
+              <w:t>3</w:t>
             </w:r>
             <w:r>
               <w:rPr>
@@ -1757,7 +1757,7 @@
               <w14:ligatures w14:val="standardContextual"/>
             </w:rPr>
           </w:pPr>
-          <w:hyperlink w:anchor="_Toc228026225" w:history="1">
+          <w:hyperlink w:anchor="_Toc231220324" w:history="1">
             <w:r>
               <w:rPr>
                 <w:rStyle w:val="Lienhypertexte"/>
@@ -1784,7 +1784,7 @@
                 <w:noProof/>
                 <w:webHidden/>
               </w:rPr>
-              <w:instrText xml:space="preserve"> PAGEREF _Toc228026225 \h </w:instrText>
+              <w:instrText xml:space="preserve"> PAGEREF _Toc231220324 \h </w:instrText>
             </w:r>
             <w:r>
               <w:rPr>
@@ -1804,7 +1804,7 @@
                 <w:noProof/>
                 <w:webHidden/>
               </w:rPr>
-              <w:t>4</w:t>
+              <w:t>3</w:t>
             </w:r>
             <w:r>
               <w:rPr>
@@ -1831,7 +1831,7 @@
               <w14:ligatures w14:val="standardContextual"/>
             </w:rPr>
           </w:pPr>
-          <w:hyperlink w:anchor="_Toc228026226" w:history="1">
+          <w:hyperlink w:anchor="_Toc231220325" w:history="1">
             <w:r>
               <w:rPr>
                 <w:rStyle w:val="Lienhypertexte"/>
@@ -1858,7 +1858,7 @@
                 <w:noProof/>
                 <w:webHidden/>
               </w:rPr>
-              <w:instrText xml:space="preserve"> PAGEREF _Toc228026226 \h </w:instrText>
+              <w:instrText xml:space="preserve"> PAGEREF _Toc231220325 \h </w:instrText>
             </w:r>
             <w:r>
               <w:rPr>
@@ -1878,7 +1878,7 @@
                 <w:noProof/>
                 <w:webHidden/>
               </w:rPr>
-              <w:t>5</w:t>
+              <w:t>4</w:t>
             </w:r>
             <w:r>
               <w:rPr>
@@ -1906,7 +1906,7 @@
               <w14:ligatures w14:val="standardContextual"/>
             </w:rPr>
           </w:pPr>
-          <w:hyperlink w:anchor="_Toc228026227" w:history="1">
+          <w:hyperlink w:anchor="_Toc231220326" w:history="1">
             <w:r>
               <w:rPr>
                 <w:rStyle w:val="Lienhypertexte"/>
@@ -1931,7 +1931,7 @@
                 <w:rStyle w:val="Lienhypertexte"/>
                 <w:noProof/>
               </w:rPr>
-              <w:t>Contexte de mon stage à L’ESTA 2E.060</w:t>
+              <w:t>Éléments et outils théoriques</w:t>
             </w:r>
             <w:r>
               <w:rPr>
@@ -1952,7 +1952,7 @@
                 <w:noProof/>
                 <w:webHidden/>
               </w:rPr>
-              <w:instrText xml:space="preserve"> PAGEREF _Toc228026227 \h </w:instrText>
+              <w:instrText xml:space="preserve"> PAGEREF _Toc231220326 \h </w:instrText>
             </w:r>
             <w:r>
               <w:rPr>
@@ -1972,7 +1972,7 @@
                 <w:noProof/>
                 <w:webHidden/>
               </w:rPr>
-              <w:t>6</w:t>
+              <w:t>4</w:t>
             </w:r>
             <w:r>
               <w:rPr>
@@ -2000,7 +2000,7 @@
               <w14:ligatures w14:val="standardContextual"/>
             </w:rPr>
           </w:pPr>
-          <w:hyperlink w:anchor="_Toc228026228" w:history="1">
+          <w:hyperlink w:anchor="_Toc231220327" w:history="1">
             <w:r>
               <w:rPr>
                 <w:rStyle w:val="Lienhypertexte"/>
@@ -2025,7 +2025,7 @@
                 <w:rStyle w:val="Lienhypertexte"/>
                 <w:noProof/>
               </w:rPr>
-              <w:t>L’ESTA 2E.060 au sein de l’AAE</w:t>
+              <w:t>Description des méthodes et choix de celle retenue pour le calcul des pentes et expositions</w:t>
             </w:r>
             <w:r>
               <w:rPr>
@@ -2046,7 +2046,7 @@
                 <w:noProof/>
                 <w:webHidden/>
               </w:rPr>
-              <w:instrText xml:space="preserve"> PAGEREF _Toc228026228 \h </w:instrText>
+              <w:instrText xml:space="preserve"> PAGEREF _Toc231220327 \h </w:instrText>
             </w:r>
             <w:r>
               <w:rPr>
@@ -2066,7 +2066,7 @@
                 <w:noProof/>
                 <w:webHidden/>
               </w:rPr>
-              <w:t>6</w:t>
+              <w:t>4</w:t>
             </w:r>
             <w:r>
               <w:rPr>
@@ -2094,7 +2094,7 @@
               <w14:ligatures w14:val="standardContextual"/>
             </w:rPr>
           </w:pPr>
-          <w:hyperlink w:anchor="_Toc228026229" w:history="1">
+          <w:hyperlink w:anchor="_Toc231220328" w:history="1">
             <w:r>
               <w:rPr>
                 <w:rStyle w:val="Lienhypertexte"/>
@@ -2119,7 +2119,7 @@
                 <w:rStyle w:val="Lienhypertexte"/>
                 <w:noProof/>
               </w:rPr>
-              <w:t>Mes missions au sein de l’ESTA</w:t>
+              <w:t>Étude de BPI</w:t>
             </w:r>
             <w:r>
               <w:rPr>
@@ -2140,7 +2140,7 @@
                 <w:noProof/>
                 <w:webHidden/>
               </w:rPr>
-              <w:instrText xml:space="preserve"> PAGEREF _Toc228026229 \h </w:instrText>
+              <w:instrText xml:space="preserve"> PAGEREF _Toc231220328 \h </w:instrText>
             </w:r>
             <w:r>
               <w:rPr>
@@ -2160,7 +2160,101 @@
                 <w:noProof/>
                 <w:webHidden/>
               </w:rPr>
-              <w:t>6</w:t>
+              <w:t>4</w:t>
+            </w:r>
+            <w:r>
+              <w:rPr>
+                <w:noProof/>
+                <w:webHidden/>
+              </w:rPr>
+              <w:fldChar w:fldCharType="end"/>
+            </w:r>
+          </w:hyperlink>
+        </w:p>
+        <w:p>
+          <w:pPr>
+            <w:pStyle w:val="TM2"/>
+            <w:tabs>
+              <w:tab w:val="left" w:pos="960"/>
+              <w:tab w:val="right" w:leader="dot" w:pos="9772"/>
+            </w:tabs>
+            <w:rPr>
+              <w:rFonts w:eastAsiaTheme="minorEastAsia"/>
+              <w:noProof/>
+              <w:kern w:val="2"/>
+              <w:sz w:val="24"/>
+              <w:szCs w:val="24"/>
+              <w:lang w:eastAsia="fr-FR"/>
+              <w14:ligatures w14:val="standardContextual"/>
+            </w:rPr>
+          </w:pPr>
+          <w:hyperlink w:anchor="_Toc231220329" w:history="1">
+            <w:r>
+              <w:rPr>
+                <w:rStyle w:val="Lienhypertexte"/>
+                <w:noProof/>
+              </w:rPr>
+              <w:t>1.3.</w:t>
+            </w:r>
+            <w:r>
+              <w:rPr>
+                <w:rFonts w:eastAsiaTheme="minorEastAsia"/>
+                <w:noProof/>
+                <w:kern w:val="2"/>
+                <w:sz w:val="24"/>
+                <w:szCs w:val="24"/>
+                <w:lang w:eastAsia="fr-FR"/>
+                <w14:ligatures w14:val="standardContextual"/>
+              </w:rPr>
+              <w:tab/>
+            </w:r>
+            <w:r>
+              <w:rPr>
+                <w:rStyle w:val="Lienhypertexte"/>
+                <w:noProof/>
+              </w:rPr>
+              <w:t>Notion de rugosité</w:t>
+            </w:r>
+            <w:r>
+              <w:rPr>
+                <w:noProof/>
+                <w:webHidden/>
+              </w:rPr>
+              <w:tab/>
+            </w:r>
+            <w:r>
+              <w:rPr>
+                <w:noProof/>
+                <w:webHidden/>
+              </w:rPr>
+              <w:fldChar w:fldCharType="begin"/>
+            </w:r>
+            <w:r>
+              <w:rPr>
+                <w:noProof/>
+                <w:webHidden/>
+              </w:rPr>
+              <w:instrText xml:space="preserve"> PAGEREF _Toc231220329 \h </w:instrText>
+            </w:r>
+            <w:r>
+              <w:rPr>
+                <w:noProof/>
+                <w:webHidden/>
+              </w:rPr>
+            </w:r>
+            <w:r>
+              <w:rPr>
+                <w:noProof/>
+                <w:webHidden/>
+              </w:rPr>
+              <w:fldChar w:fldCharType="separate"/>
+            </w:r>
+            <w:r>
+              <w:rPr>
+                <w:noProof/>
+                <w:webHidden/>
+              </w:rPr>
+              <w:t>4</w:t>
             </w:r>
             <w:r>
               <w:rPr>
@@ -2188,7 +2282,7 @@
               <w14:ligatures w14:val="standardContextual"/>
             </w:rPr>
           </w:pPr>
-          <w:hyperlink w:anchor="_Toc228026230" w:history="1">
+          <w:hyperlink w:anchor="_Toc231220330" w:history="1">
             <w:r>
               <w:rPr>
                 <w:rStyle w:val="Lienhypertexte"/>
@@ -2213,7 +2307,7 @@
                 <w:rStyle w:val="Lienhypertexte"/>
                 <w:noProof/>
               </w:rPr>
-              <w:t>Passage de la théorie militaire au premier poste : le choc du réel</w:t>
+              <w:t>Modèles de classification</w:t>
             </w:r>
             <w:r>
               <w:rPr>
@@ -2234,7 +2328,7 @@
                 <w:noProof/>
                 <w:webHidden/>
               </w:rPr>
-              <w:instrText xml:space="preserve"> PAGEREF _Toc228026230 \h </w:instrText>
+              <w:instrText xml:space="preserve"> PAGEREF _Toc231220330 \h </w:instrText>
             </w:r>
             <w:r>
               <w:rPr>
@@ -2254,7 +2348,7 @@
                 <w:noProof/>
                 <w:webHidden/>
               </w:rPr>
-              <w:t>7</w:t>
+              <w:t>4</w:t>
             </w:r>
             <w:r>
               <w:rPr>
@@ -2282,7 +2376,7 @@
               <w14:ligatures w14:val="standardContextual"/>
             </w:rPr>
           </w:pPr>
-          <w:hyperlink w:anchor="_Toc228026231" w:history="1">
+          <w:hyperlink w:anchor="_Toc231220331" w:history="1">
             <w:r>
               <w:rPr>
                 <w:rStyle w:val="Lienhypertexte"/>
@@ -2307,7 +2401,7 @@
                 <w:rStyle w:val="Lienhypertexte"/>
                 <w:noProof/>
               </w:rPr>
-              <w:t>Mythe de la fraternité et réalité bureaucratique</w:t>
+              <w:t>Un premier modèle : modèle de Dikau</w:t>
             </w:r>
             <w:r>
               <w:rPr>
@@ -2328,7 +2422,7 @@
                 <w:noProof/>
                 <w:webHidden/>
               </w:rPr>
-              <w:instrText xml:space="preserve"> PAGEREF _Toc228026231 \h </w:instrText>
+              <w:instrText xml:space="preserve"> PAGEREF _Toc231220331 \h </w:instrText>
             </w:r>
             <w:r>
               <w:rPr>
@@ -2348,7 +2442,7 @@
                 <w:noProof/>
                 <w:webHidden/>
               </w:rPr>
-              <w:t>7</w:t>
+              <w:t>4</w:t>
             </w:r>
             <w:r>
               <w:rPr>
@@ -2376,7 +2470,7 @@
               <w14:ligatures w14:val="standardContextual"/>
             </w:rPr>
           </w:pPr>
-          <w:hyperlink w:anchor="_Toc228026232" w:history="1">
+          <w:hyperlink w:anchor="_Toc231220332" w:history="1">
             <w:r>
               <w:rPr>
                 <w:rStyle w:val="Lienhypertexte"/>
@@ -2401,7 +2495,7 @@
                 <w:rStyle w:val="Lienhypertexte"/>
                 <w:noProof/>
               </w:rPr>
-              <w:t>Solitude du nouveau : entre syndrome de l’imposteur et rupture de     transmission</w:t>
+              <w:t>Notre modèle : « Inspection et Évaluation des Topographies Aquatiques » (IETA)</w:t>
             </w:r>
             <w:r>
               <w:rPr>
@@ -2422,7 +2516,7 @@
                 <w:noProof/>
                 <w:webHidden/>
               </w:rPr>
-              <w:instrText xml:space="preserve"> PAGEREF _Toc228026232 \h </w:instrText>
+              <w:instrText xml:space="preserve"> PAGEREF _Toc231220332 \h </w:instrText>
             </w:r>
             <w:r>
               <w:rPr>
@@ -2442,101 +2536,7 @@
                 <w:noProof/>
                 <w:webHidden/>
               </w:rPr>
-              <w:t>9</w:t>
-            </w:r>
-            <w:r>
-              <w:rPr>
-                <w:noProof/>
-                <w:webHidden/>
-              </w:rPr>
-              <w:fldChar w:fldCharType="end"/>
-            </w:r>
-          </w:hyperlink>
-        </w:p>
-        <w:p>
-          <w:pPr>
-            <w:pStyle w:val="TM1"/>
-            <w:tabs>
-              <w:tab w:val="left" w:pos="480"/>
-              <w:tab w:val="right" w:leader="dot" w:pos="9772"/>
-            </w:tabs>
-            <w:rPr>
-              <w:rFonts w:eastAsiaTheme="minorEastAsia"/>
-              <w:noProof/>
-              <w:kern w:val="2"/>
-              <w:sz w:val="24"/>
-              <w:szCs w:val="24"/>
-              <w:lang w:eastAsia="fr-FR"/>
-              <w14:ligatures w14:val="standardContextual"/>
-            </w:rPr>
-          </w:pPr>
-          <w:hyperlink w:anchor="_Toc228026233" w:history="1">
-            <w:r>
-              <w:rPr>
-                <w:rStyle w:val="Lienhypertexte"/>
-                <w:noProof/>
-              </w:rPr>
-              <w:t>3.</w:t>
-            </w:r>
-            <w:r>
-              <w:rPr>
-                <w:rFonts w:eastAsiaTheme="minorEastAsia"/>
-                <w:noProof/>
-                <w:kern w:val="2"/>
-                <w:sz w:val="24"/>
-                <w:szCs w:val="24"/>
-                <w:lang w:eastAsia="fr-FR"/>
-                <w14:ligatures w14:val="standardContextual"/>
-              </w:rPr>
-              <w:tab/>
-            </w:r>
-            <w:r>
-              <w:rPr>
-                <w:rStyle w:val="Lienhypertexte"/>
-                <w:noProof/>
-              </w:rPr>
-              <w:t>Facteurs sociaux de solitudes dans les armées : les barrières invisibles</w:t>
-            </w:r>
-            <w:r>
-              <w:rPr>
-                <w:noProof/>
-                <w:webHidden/>
-              </w:rPr>
-              <w:tab/>
-            </w:r>
-            <w:r>
-              <w:rPr>
-                <w:noProof/>
-                <w:webHidden/>
-              </w:rPr>
-              <w:fldChar w:fldCharType="begin"/>
-            </w:r>
-            <w:r>
-              <w:rPr>
-                <w:noProof/>
-                <w:webHidden/>
-              </w:rPr>
-              <w:instrText xml:space="preserve"> PAGEREF _Toc228026233 \h </w:instrText>
-            </w:r>
-            <w:r>
-              <w:rPr>
-                <w:noProof/>
-                <w:webHidden/>
-              </w:rPr>
-            </w:r>
-            <w:r>
-              <w:rPr>
-                <w:noProof/>
-                <w:webHidden/>
-              </w:rPr>
-              <w:fldChar w:fldCharType="separate"/>
-            </w:r>
-            <w:r>
-              <w:rPr>
-                <w:noProof/>
-                <w:webHidden/>
-              </w:rPr>
-              <w:t>10</w:t>
+              <w:t>4</w:t>
             </w:r>
             <w:r>
               <w:rPr>
@@ -2564,13 +2564,13 @@
               <w14:ligatures w14:val="standardContextual"/>
             </w:rPr>
           </w:pPr>
-          <w:hyperlink w:anchor="_Toc228026234" w:history="1">
+          <w:hyperlink w:anchor="_Toc231220333" w:history="1">
             <w:r>
               <w:rPr>
                 <w:rStyle w:val="Lienhypertexte"/>
                 <w:noProof/>
               </w:rPr>
-              <w:t>3.1.</w:t>
+              <w:t>2.3.</w:t>
             </w:r>
             <w:r>
               <w:rPr>
@@ -2589,7 +2589,7 @@
                 <w:rStyle w:val="Lienhypertexte"/>
                 <w:noProof/>
               </w:rPr>
-              <w:t>Formes de discriminations</w:t>
+              <w:t>Le manque de reconnaissance de l’institution</w:t>
             </w:r>
             <w:r>
               <w:rPr>
@@ -2610,7 +2610,7 @@
                 <w:noProof/>
                 <w:webHidden/>
               </w:rPr>
-              <w:instrText xml:space="preserve"> PAGEREF _Toc228026234 \h </w:instrText>
+              <w:instrText xml:space="preserve"> PAGEREF _Toc231220333 \h </w:instrText>
             </w:r>
             <w:r>
               <w:rPr>
@@ -2630,571 +2630,7 @@
                 <w:noProof/>
                 <w:webHidden/>
               </w:rPr>
-              <w:t>10</w:t>
-            </w:r>
-            <w:r>
-              <w:rPr>
-                <w:noProof/>
-                <w:webHidden/>
-              </w:rPr>
-              <w:fldChar w:fldCharType="end"/>
-            </w:r>
-          </w:hyperlink>
-        </w:p>
-        <w:p>
-          <w:pPr>
-            <w:pStyle w:val="TM2"/>
-            <w:tabs>
-              <w:tab w:val="left" w:pos="960"/>
-              <w:tab w:val="right" w:leader="dot" w:pos="9772"/>
-            </w:tabs>
-            <w:rPr>
-              <w:rFonts w:eastAsiaTheme="minorEastAsia"/>
-              <w:noProof/>
-              <w:kern w:val="2"/>
-              <w:sz w:val="24"/>
-              <w:szCs w:val="24"/>
-              <w:lang w:eastAsia="fr-FR"/>
-              <w14:ligatures w14:val="standardContextual"/>
-            </w:rPr>
-          </w:pPr>
-          <w:hyperlink w:anchor="_Toc228026235" w:history="1">
-            <w:r>
-              <w:rPr>
-                <w:rStyle w:val="Lienhypertexte"/>
-                <w:noProof/>
-              </w:rPr>
-              <w:t>3.2.</w:t>
-            </w:r>
-            <w:r>
-              <w:rPr>
-                <w:rFonts w:eastAsiaTheme="minorEastAsia"/>
-                <w:noProof/>
-                <w:kern w:val="2"/>
-                <w:sz w:val="24"/>
-                <w:szCs w:val="24"/>
-                <w:lang w:eastAsia="fr-FR"/>
-                <w14:ligatures w14:val="standardContextual"/>
-              </w:rPr>
-              <w:tab/>
-            </w:r>
-            <w:r>
-              <w:rPr>
-                <w:rStyle w:val="Lienhypertexte"/>
-                <w:noProof/>
-              </w:rPr>
-              <w:t>Isolement fonctionnel : exemple de la relation mécanicien/pilote</w:t>
-            </w:r>
-            <w:r>
-              <w:rPr>
-                <w:noProof/>
-                <w:webHidden/>
-              </w:rPr>
-              <w:tab/>
-            </w:r>
-            <w:r>
-              <w:rPr>
-                <w:noProof/>
-                <w:webHidden/>
-              </w:rPr>
-              <w:fldChar w:fldCharType="begin"/>
-            </w:r>
-            <w:r>
-              <w:rPr>
-                <w:noProof/>
-                <w:webHidden/>
-              </w:rPr>
-              <w:instrText xml:space="preserve"> PAGEREF _Toc228026235 \h </w:instrText>
-            </w:r>
-            <w:r>
-              <w:rPr>
-                <w:noProof/>
-                <w:webHidden/>
-              </w:rPr>
-            </w:r>
-            <w:r>
-              <w:rPr>
-                <w:noProof/>
-                <w:webHidden/>
-              </w:rPr>
-              <w:fldChar w:fldCharType="separate"/>
-            </w:r>
-            <w:r>
-              <w:rPr>
-                <w:noProof/>
-                <w:webHidden/>
-              </w:rPr>
-              <w:t>11</w:t>
-            </w:r>
-            <w:r>
-              <w:rPr>
-                <w:noProof/>
-                <w:webHidden/>
-              </w:rPr>
-              <w:fldChar w:fldCharType="end"/>
-            </w:r>
-          </w:hyperlink>
-        </w:p>
-        <w:p>
-          <w:pPr>
-            <w:pStyle w:val="TM2"/>
-            <w:tabs>
-              <w:tab w:val="left" w:pos="960"/>
-              <w:tab w:val="right" w:leader="dot" w:pos="9772"/>
-            </w:tabs>
-            <w:rPr>
-              <w:rFonts w:eastAsiaTheme="minorEastAsia"/>
-              <w:noProof/>
-              <w:kern w:val="2"/>
-              <w:sz w:val="24"/>
-              <w:szCs w:val="24"/>
-              <w:lang w:eastAsia="fr-FR"/>
-              <w14:ligatures w14:val="standardContextual"/>
-            </w:rPr>
-          </w:pPr>
-          <w:hyperlink w:anchor="_Toc228026236" w:history="1">
-            <w:r>
-              <w:rPr>
-                <w:rStyle w:val="Lienhypertexte"/>
-                <w:noProof/>
-              </w:rPr>
-              <w:t>3.3.</w:t>
-            </w:r>
-            <w:r>
-              <w:rPr>
-                <w:rFonts w:eastAsiaTheme="minorEastAsia"/>
-                <w:noProof/>
-                <w:kern w:val="2"/>
-                <w:sz w:val="24"/>
-                <w:szCs w:val="24"/>
-                <w:lang w:eastAsia="fr-FR"/>
-                <w14:ligatures w14:val="standardContextual"/>
-              </w:rPr>
-              <w:tab/>
-            </w:r>
-            <w:r>
-              <w:rPr>
-                <w:rStyle w:val="Lienhypertexte"/>
-                <w:noProof/>
-              </w:rPr>
-              <w:t>Hybridation des cultures dans l’ESTA</w:t>
-            </w:r>
-            <w:r>
-              <w:rPr>
-                <w:noProof/>
-                <w:webHidden/>
-              </w:rPr>
-              <w:tab/>
-            </w:r>
-            <w:r>
-              <w:rPr>
-                <w:noProof/>
-                <w:webHidden/>
-              </w:rPr>
-              <w:fldChar w:fldCharType="begin"/>
-            </w:r>
-            <w:r>
-              <w:rPr>
-                <w:noProof/>
-                <w:webHidden/>
-              </w:rPr>
-              <w:instrText xml:space="preserve"> PAGEREF _Toc228026236 \h </w:instrText>
-            </w:r>
-            <w:r>
-              <w:rPr>
-                <w:noProof/>
-                <w:webHidden/>
-              </w:rPr>
-            </w:r>
-            <w:r>
-              <w:rPr>
-                <w:noProof/>
-                <w:webHidden/>
-              </w:rPr>
-              <w:fldChar w:fldCharType="separate"/>
-            </w:r>
-            <w:r>
-              <w:rPr>
-                <w:noProof/>
-                <w:webHidden/>
-              </w:rPr>
-              <w:t>13</w:t>
-            </w:r>
-            <w:r>
-              <w:rPr>
-                <w:noProof/>
-                <w:webHidden/>
-              </w:rPr>
-              <w:fldChar w:fldCharType="end"/>
-            </w:r>
-          </w:hyperlink>
-        </w:p>
-        <w:p>
-          <w:pPr>
-            <w:pStyle w:val="TM1"/>
-            <w:tabs>
-              <w:tab w:val="left" w:pos="480"/>
-              <w:tab w:val="right" w:leader="dot" w:pos="9772"/>
-            </w:tabs>
-            <w:rPr>
-              <w:rFonts w:eastAsiaTheme="minorEastAsia"/>
-              <w:noProof/>
-              <w:kern w:val="2"/>
-              <w:sz w:val="24"/>
-              <w:szCs w:val="24"/>
-              <w:lang w:eastAsia="fr-FR"/>
-              <w14:ligatures w14:val="standardContextual"/>
-            </w:rPr>
-          </w:pPr>
-          <w:hyperlink w:anchor="_Toc228026237" w:history="1">
-            <w:r>
-              <w:rPr>
-                <w:rStyle w:val="Lienhypertexte"/>
-                <w:noProof/>
-              </w:rPr>
-              <w:t>4.</w:t>
-            </w:r>
-            <w:r>
-              <w:rPr>
-                <w:rFonts w:eastAsiaTheme="minorEastAsia"/>
-                <w:noProof/>
-                <w:kern w:val="2"/>
-                <w:sz w:val="24"/>
-                <w:szCs w:val="24"/>
-                <w:lang w:eastAsia="fr-FR"/>
-                <w14:ligatures w14:val="standardContextual"/>
-              </w:rPr>
-              <w:tab/>
-            </w:r>
-            <w:r>
-              <w:rPr>
-                <w:rStyle w:val="Lienhypertexte"/>
-                <w:noProof/>
-              </w:rPr>
-              <w:t>Différents degrés de solitude : les spécificités du monde militaire</w:t>
-            </w:r>
-            <w:r>
-              <w:rPr>
-                <w:noProof/>
-                <w:webHidden/>
-              </w:rPr>
-              <w:tab/>
-            </w:r>
-            <w:r>
-              <w:rPr>
-                <w:noProof/>
-                <w:webHidden/>
-              </w:rPr>
-              <w:fldChar w:fldCharType="begin"/>
-            </w:r>
-            <w:r>
-              <w:rPr>
-                <w:noProof/>
-                <w:webHidden/>
-              </w:rPr>
-              <w:instrText xml:space="preserve"> PAGEREF _Toc228026237 \h </w:instrText>
-            </w:r>
-            <w:r>
-              <w:rPr>
-                <w:noProof/>
-                <w:webHidden/>
-              </w:rPr>
-            </w:r>
-            <w:r>
-              <w:rPr>
-                <w:noProof/>
-                <w:webHidden/>
-              </w:rPr>
-              <w:fldChar w:fldCharType="separate"/>
-            </w:r>
-            <w:r>
-              <w:rPr>
-                <w:noProof/>
-                <w:webHidden/>
-              </w:rPr>
-              <w:t>15</w:t>
-            </w:r>
-            <w:r>
-              <w:rPr>
-                <w:noProof/>
-                <w:webHidden/>
-              </w:rPr>
-              <w:fldChar w:fldCharType="end"/>
-            </w:r>
-          </w:hyperlink>
-        </w:p>
-        <w:p>
-          <w:pPr>
-            <w:pStyle w:val="TM2"/>
-            <w:tabs>
-              <w:tab w:val="left" w:pos="960"/>
-              <w:tab w:val="right" w:leader="dot" w:pos="9772"/>
-            </w:tabs>
-            <w:rPr>
-              <w:rFonts w:eastAsiaTheme="minorEastAsia"/>
-              <w:noProof/>
-              <w:kern w:val="2"/>
-              <w:sz w:val="24"/>
-              <w:szCs w:val="24"/>
-              <w:lang w:eastAsia="fr-FR"/>
-              <w14:ligatures w14:val="standardContextual"/>
-            </w:rPr>
-          </w:pPr>
-          <w:hyperlink w:anchor="_Toc228026238" w:history="1">
-            <w:r>
-              <w:rPr>
-                <w:rStyle w:val="Lienhypertexte"/>
-                <w:noProof/>
-              </w:rPr>
-              <w:t>4.1.</w:t>
-            </w:r>
-            <w:r>
-              <w:rPr>
-                <w:rFonts w:eastAsiaTheme="minorEastAsia"/>
-                <w:noProof/>
-                <w:kern w:val="2"/>
-                <w:sz w:val="24"/>
-                <w:szCs w:val="24"/>
-                <w:lang w:eastAsia="fr-FR"/>
-                <w14:ligatures w14:val="standardContextual"/>
-              </w:rPr>
-              <w:tab/>
-            </w:r>
-            <w:r>
-              <w:rPr>
-                <w:rStyle w:val="Lienhypertexte"/>
-                <w:noProof/>
-              </w:rPr>
-              <w:t>La solitude du chef</w:t>
-            </w:r>
-            <w:r>
-              <w:rPr>
-                <w:noProof/>
-                <w:webHidden/>
-              </w:rPr>
-              <w:tab/>
-            </w:r>
-            <w:r>
-              <w:rPr>
-                <w:noProof/>
-                <w:webHidden/>
-              </w:rPr>
-              <w:fldChar w:fldCharType="begin"/>
-            </w:r>
-            <w:r>
-              <w:rPr>
-                <w:noProof/>
-                <w:webHidden/>
-              </w:rPr>
-              <w:instrText xml:space="preserve"> PAGEREF _Toc228026238 \h </w:instrText>
-            </w:r>
-            <w:r>
-              <w:rPr>
-                <w:noProof/>
-                <w:webHidden/>
-              </w:rPr>
-            </w:r>
-            <w:r>
-              <w:rPr>
-                <w:noProof/>
-                <w:webHidden/>
-              </w:rPr>
-              <w:fldChar w:fldCharType="separate"/>
-            </w:r>
-            <w:r>
-              <w:rPr>
-                <w:noProof/>
-                <w:webHidden/>
-              </w:rPr>
-              <w:t>15</w:t>
-            </w:r>
-            <w:r>
-              <w:rPr>
-                <w:noProof/>
-                <w:webHidden/>
-              </w:rPr>
-              <w:fldChar w:fldCharType="end"/>
-            </w:r>
-          </w:hyperlink>
-        </w:p>
-        <w:p>
-          <w:pPr>
-            <w:pStyle w:val="TM2"/>
-            <w:tabs>
-              <w:tab w:val="left" w:pos="960"/>
-              <w:tab w:val="right" w:leader="dot" w:pos="9772"/>
-            </w:tabs>
-            <w:rPr>
-              <w:rFonts w:eastAsiaTheme="minorEastAsia"/>
-              <w:noProof/>
-              <w:kern w:val="2"/>
-              <w:sz w:val="24"/>
-              <w:szCs w:val="24"/>
-              <w:lang w:eastAsia="fr-FR"/>
-              <w14:ligatures w14:val="standardContextual"/>
-            </w:rPr>
-          </w:pPr>
-          <w:hyperlink w:anchor="_Toc228026239" w:history="1">
-            <w:r>
-              <w:rPr>
-                <w:rStyle w:val="Lienhypertexte"/>
-                <w:noProof/>
-              </w:rPr>
-              <w:t>4.2.</w:t>
-            </w:r>
-            <w:r>
-              <w:rPr>
-                <w:rFonts w:eastAsiaTheme="minorEastAsia"/>
-                <w:noProof/>
-                <w:kern w:val="2"/>
-                <w:sz w:val="24"/>
-                <w:szCs w:val="24"/>
-                <w:lang w:eastAsia="fr-FR"/>
-                <w14:ligatures w14:val="standardContextual"/>
-              </w:rPr>
-              <w:tab/>
-            </w:r>
-            <w:r>
-              <w:rPr>
-                <w:rStyle w:val="Lienhypertexte"/>
-                <w:noProof/>
-              </w:rPr>
-              <w:t>L’instabilité géographique : source d’isolement familial</w:t>
-            </w:r>
-            <w:r>
-              <w:rPr>
-                <w:noProof/>
-                <w:webHidden/>
-              </w:rPr>
-              <w:tab/>
-            </w:r>
-            <w:r>
-              <w:rPr>
-                <w:noProof/>
-                <w:webHidden/>
-              </w:rPr>
-              <w:fldChar w:fldCharType="begin"/>
-            </w:r>
-            <w:r>
-              <w:rPr>
-                <w:noProof/>
-                <w:webHidden/>
-              </w:rPr>
-              <w:instrText xml:space="preserve"> PAGEREF _Toc228026239 \h </w:instrText>
-            </w:r>
-            <w:r>
-              <w:rPr>
-                <w:noProof/>
-                <w:webHidden/>
-              </w:rPr>
-            </w:r>
-            <w:r>
-              <w:rPr>
-                <w:noProof/>
-                <w:webHidden/>
-              </w:rPr>
-              <w:fldChar w:fldCharType="separate"/>
-            </w:r>
-            <w:r>
-              <w:rPr>
-                <w:noProof/>
-                <w:webHidden/>
-              </w:rPr>
-              <w:t>16</w:t>
-            </w:r>
-            <w:r>
-              <w:rPr>
-                <w:noProof/>
-                <w:webHidden/>
-              </w:rPr>
-              <w:fldChar w:fldCharType="end"/>
-            </w:r>
-          </w:hyperlink>
-        </w:p>
-        <w:p>
-          <w:pPr>
-            <w:pStyle w:val="TM2"/>
-            <w:tabs>
-              <w:tab w:val="left" w:pos="960"/>
-              <w:tab w:val="right" w:leader="dot" w:pos="9772"/>
-            </w:tabs>
-            <w:rPr>
-              <w:rFonts w:eastAsiaTheme="minorEastAsia"/>
-              <w:noProof/>
-              <w:kern w:val="2"/>
-              <w:sz w:val="24"/>
-              <w:szCs w:val="24"/>
-              <w:lang w:eastAsia="fr-FR"/>
-              <w14:ligatures w14:val="standardContextual"/>
-            </w:rPr>
-          </w:pPr>
-          <w:hyperlink w:anchor="_Toc228026240" w:history="1">
-            <w:r>
-              <w:rPr>
-                <w:rStyle w:val="Lienhypertexte"/>
-                <w:noProof/>
-              </w:rPr>
-              <w:t>4.3.</w:t>
-            </w:r>
-            <w:r>
-              <w:rPr>
-                <w:rFonts w:eastAsiaTheme="minorEastAsia"/>
-                <w:noProof/>
-                <w:kern w:val="2"/>
-                <w:sz w:val="24"/>
-                <w:szCs w:val="24"/>
-                <w:lang w:eastAsia="fr-FR"/>
-                <w14:ligatures w14:val="standardContextual"/>
-              </w:rPr>
-              <w:tab/>
-            </w:r>
-            <w:r>
-              <w:rPr>
-                <w:rStyle w:val="Lienhypertexte"/>
-                <w:noProof/>
-              </w:rPr>
-              <w:t>Le manque de reconnaissance de l’institution</w:t>
-            </w:r>
-            <w:r>
-              <w:rPr>
-                <w:noProof/>
-                <w:webHidden/>
-              </w:rPr>
-              <w:tab/>
-            </w:r>
-            <w:r>
-              <w:rPr>
-                <w:noProof/>
-                <w:webHidden/>
-              </w:rPr>
-              <w:fldChar w:fldCharType="begin"/>
-            </w:r>
-            <w:r>
-              <w:rPr>
-                <w:noProof/>
-                <w:webHidden/>
-              </w:rPr>
-              <w:instrText xml:space="preserve"> PAGEREF _Toc228026240 \h </w:instrText>
-            </w:r>
-            <w:r>
-              <w:rPr>
-                <w:noProof/>
-                <w:webHidden/>
-              </w:rPr>
-            </w:r>
-            <w:r>
-              <w:rPr>
-                <w:noProof/>
-                <w:webHidden/>
-              </w:rPr>
-              <w:fldChar w:fldCharType="separate"/>
-            </w:r>
-            <w:r>
-              <w:rPr>
-                <w:noProof/>
-                <w:webHidden/>
-              </w:rPr>
-              <w:t>17</w:t>
+              <w:t>4</w:t>
             </w:r>
             <w:r>
               <w:rPr>
@@ -3221,7 +2657,7 @@
               <w14:ligatures w14:val="standardContextual"/>
             </w:rPr>
           </w:pPr>
-          <w:hyperlink w:anchor="_Toc228026241" w:history="1">
+          <w:hyperlink w:anchor="_Toc231220334" w:history="1">
             <w:r>
               <w:rPr>
                 <w:rStyle w:val="Lienhypertexte"/>
@@ -3248,7 +2684,7 @@
                 <w:noProof/>
                 <w:webHidden/>
               </w:rPr>
-              <w:instrText xml:space="preserve"> PAGEREF _Toc228026241 \h </w:instrText>
+              <w:instrText xml:space="preserve"> PAGEREF _Toc231220334 \h </w:instrText>
             </w:r>
             <w:r>
               <w:rPr>
@@ -3268,7 +2704,7 @@
                 <w:noProof/>
                 <w:webHidden/>
               </w:rPr>
-              <w:t>19</w:t>
+              <w:t>4</w:t>
             </w:r>
             <w:r>
               <w:rPr>
@@ -3295,7 +2731,7 @@
               <w14:ligatures w14:val="standardContextual"/>
             </w:rPr>
           </w:pPr>
-          <w:hyperlink w:anchor="_Toc228026242" w:history="1">
+          <w:hyperlink w:anchor="_Toc231220335" w:history="1">
             <w:r>
               <w:rPr>
                 <w:rStyle w:val="Lienhypertexte"/>
@@ -3322,7 +2758,7 @@
                 <w:noProof/>
                 <w:webHidden/>
               </w:rPr>
-              <w:instrText xml:space="preserve"> PAGEREF _Toc228026242 \h </w:instrText>
+              <w:instrText xml:space="preserve"> PAGEREF _Toc231220335 \h </w:instrText>
             </w:r>
             <w:r>
               <w:rPr>
@@ -3342,7 +2778,7 @@
                 <w:noProof/>
                 <w:webHidden/>
               </w:rPr>
-              <w:t>20</w:t>
+              <w:t>4</w:t>
             </w:r>
             <w:r>
               <w:rPr>
@@ -3369,7 +2805,7 @@
               <w14:ligatures w14:val="standardContextual"/>
             </w:rPr>
           </w:pPr>
-          <w:hyperlink w:anchor="_Toc228026243" w:history="1">
+          <w:hyperlink w:anchor="_Toc231220336" w:history="1">
             <w:r>
               <w:rPr>
                 <w:rStyle w:val="Lienhypertexte"/>
@@ -3396,7 +2832,7 @@
                 <w:noProof/>
                 <w:webHidden/>
               </w:rPr>
-              <w:instrText xml:space="preserve"> PAGEREF _Toc228026243 \h </w:instrText>
+              <w:instrText xml:space="preserve"> PAGEREF _Toc231220336 \h </w:instrText>
             </w:r>
             <w:r>
               <w:rPr>
@@ -3416,7 +2852,81 @@
                 <w:noProof/>
                 <w:webHidden/>
               </w:rPr>
-              <w:t>21</w:t>
+              <w:t>4</w:t>
+            </w:r>
+            <w:r>
+              <w:rPr>
+                <w:noProof/>
+                <w:webHidden/>
+              </w:rPr>
+              <w:fldChar w:fldCharType="end"/>
+            </w:r>
+          </w:hyperlink>
+        </w:p>
+        <w:p>
+          <w:pPr>
+            <w:pStyle w:val="TM1"/>
+            <w:tabs>
+              <w:tab w:val="right" w:leader="dot" w:pos="9772"/>
+            </w:tabs>
+            <w:rPr>
+              <w:rFonts w:eastAsiaTheme="minorEastAsia"/>
+              <w:noProof/>
+              <w:kern w:val="2"/>
+              <w:sz w:val="24"/>
+              <w:szCs w:val="24"/>
+              <w:lang w:eastAsia="fr-FR"/>
+              <w14:ligatures w14:val="standardContextual"/>
+            </w:rPr>
+          </w:pPr>
+          <w:hyperlink w:anchor="_Toc231220337" w:history="1">
+            <w:r>
+              <w:rPr>
+                <w:rStyle w:val="Lienhypertexte"/>
+                <w:noProof/>
+              </w:rPr>
+              <w:t>Annexes</w:t>
+            </w:r>
+            <w:r>
+              <w:rPr>
+                <w:noProof/>
+                <w:webHidden/>
+              </w:rPr>
+              <w:tab/>
+            </w:r>
+            <w:r>
+              <w:rPr>
+                <w:noProof/>
+                <w:webHidden/>
+              </w:rPr>
+              <w:fldChar w:fldCharType="begin"/>
+            </w:r>
+            <w:r>
+              <w:rPr>
+                <w:noProof/>
+                <w:webHidden/>
+              </w:rPr>
+              <w:instrText xml:space="preserve"> PAGEREF _Toc231220337 \h </w:instrText>
+            </w:r>
+            <w:r>
+              <w:rPr>
+                <w:noProof/>
+                <w:webHidden/>
+              </w:rPr>
+            </w:r>
+            <w:r>
+              <w:rPr>
+                <w:noProof/>
+                <w:webHidden/>
+              </w:rPr>
+              <w:fldChar w:fldCharType="separate"/>
+            </w:r>
+            <w:r>
+              <w:rPr>
+                <w:noProof/>
+                <w:webHidden/>
+              </w:rPr>
+              <w:t>4</w:t>
             </w:r>
             <w:r>
               <w:rPr>
@@ -3447,7 +2957,7 @@
       <w:pPr>
         <w:pStyle w:val="Titre1"/>
       </w:pPr>
-      <w:bookmarkStart w:id="5" w:name="_Toc228026224"/>
+      <w:bookmarkStart w:id="5" w:name="_Toc231220323"/>
       <w:r>
         <w:t>Résumé</w:t>
       </w:r>
@@ -3490,9 +3000,8 @@
       <w:pPr>
         <w:pStyle w:val="Titre1"/>
       </w:pPr>
-      <w:bookmarkStart w:id="6" w:name="_Toc228026225"/>
+      <w:bookmarkStart w:id="6" w:name="_Toc231220324"/>
       <w:r>
-        <w:lastRenderedPageBreak/>
         <w:t>Abstract</w:t>
       </w:r>
       <w:bookmarkEnd w:id="6"/>
@@ -3549,8 +3058,9 @@
       <w:pPr>
         <w:pStyle w:val="Titre1"/>
       </w:pPr>
-      <w:bookmarkStart w:id="7" w:name="_Toc228026226"/>
+      <w:bookmarkStart w:id="7" w:name="_Toc231220325"/>
       <w:r>
+        <w:lastRenderedPageBreak/>
         <w:t>Introduction</w:t>
       </w:r>
       <w:bookmarkEnd w:id="7"/>
@@ -3586,17 +3096,11 @@
           <w:numId w:val="5"/>
         </w:numPr>
       </w:pPr>
-      <w:bookmarkStart w:id="8" w:name="_Toc228026227"/>
+      <w:bookmarkStart w:id="8" w:name="_Toc231220326"/>
       <w:r>
-        <w:t xml:space="preserve">Contexte de mon stage à </w:t>
-      </w:r>
-      <w:r>
-        <w:t>L’ESTA 2E.060</w:t>
+        <w:t>Éléments et outils théoriques</w:t>
       </w:r>
       <w:bookmarkEnd w:id="8"/>
-      <w:r>
-        <w:t xml:space="preserve"> </w:t>
-      </w:r>
     </w:p>
     <w:p>
       <w:pPr>
@@ -3609,11 +3113,26 @@
       <w:r>
         <w:t xml:space="preserve"> </w:t>
       </w:r>
-      <w:bookmarkStart w:id="9" w:name="_Toc228026228"/>
+      <w:bookmarkStart w:id="9" w:name="_Toc231220327"/>
       <w:r>
-        <w:t>L’ESTA 2E.060 au sein de l’AAE</w:t>
+        <w:t xml:space="preserve">Description </w:t>
+      </w:r>
+      <w:r>
+        <w:t xml:space="preserve">des méthodes et choix de celle retenue </w:t>
+      </w:r>
+      <w:r>
+        <w:t xml:space="preserve">pour </w:t>
+      </w:r>
+      <w:r>
+        <w:t>le calcul d</w:t>
+      </w:r>
+      <w:r>
+        <w:t>es pentes et expositions</w:t>
       </w:r>
       <w:bookmarkEnd w:id="9"/>
+      <w:r>
+        <w:t xml:space="preserve"> </w:t>
+      </w:r>
     </w:p>
     <w:p>
       <w:pPr>
@@ -3628,13 +3147,41 @@
           <w:numId w:val="1"/>
         </w:numPr>
       </w:pPr>
-      <w:bookmarkStart w:id="10" w:name="_Toc228026229"/>
       <w:r>
-        <w:t>Mes missions au sein de l’ESTA</w:t>
+        <w:t xml:space="preserve"> </w:t>
+      </w:r>
+      <w:bookmarkStart w:id="10" w:name="_Toc231220328"/>
+      <w:r>
+        <w:t>Étude de BPI</w:t>
       </w:r>
       <w:bookmarkEnd w:id="10"/>
     </w:p>
     <w:p/>
+    <w:p>
+      <w:pPr>
+        <w:pStyle w:val="Titre2"/>
+        <w:numPr>
+          <w:ilvl w:val="1"/>
+          <w:numId w:val="1"/>
+        </w:numPr>
+      </w:pPr>
+      <w:r>
+        <w:t xml:space="preserve"> </w:t>
+      </w:r>
+      <w:bookmarkStart w:id="11" w:name="_Toc231220329"/>
+      <w:r>
+        <w:t>Notion de rugosité</w:t>
+      </w:r>
+      <w:bookmarkEnd w:id="11"/>
+    </w:p>
+    <w:p>
+      <w:pPr>
+        <w:rPr>
+          <w:sz w:val="24"/>
+          <w:szCs w:val="24"/>
+        </w:rPr>
+      </w:pPr>
+    </w:p>
     <w:p>
       <w:pPr>
         <w:pStyle w:val="Titre1"/>
@@ -3643,11 +3190,14 @@
           <w:numId w:val="5"/>
         </w:numPr>
       </w:pPr>
-      <w:bookmarkStart w:id="11" w:name="_Toc228026230"/>
+      <w:bookmarkStart w:id="12" w:name="_Toc231220330"/>
       <w:r>
-        <w:t>Passage de la théorie militaire au premier poste : le choc du réel</w:t>
+        <w:t>Modèles de classification</w:t>
       </w:r>
-      <w:bookmarkEnd w:id="11"/>
+      <w:bookmarkEnd w:id="12"/>
+      <w:r>
+        <w:t xml:space="preserve"> </w:t>
+      </w:r>
     </w:p>
     <w:p>
       <w:pPr>
@@ -3660,21 +3210,19 @@
       <w:r>
         <w:t xml:space="preserve"> </w:t>
       </w:r>
-      <w:bookmarkStart w:id="12" w:name="_Toc228026231"/>
+      <w:bookmarkStart w:id="13" w:name="_Toc231220331"/>
       <w:r>
-        <w:t>Mythe de la fraternité et réalité bureaucratique</w:t>
+        <w:t xml:space="preserve">Un premier modèle : modèle de </w:t>
       </w:r>
-      <w:bookmarkEnd w:id="12"/>
-    </w:p>
-    <w:p>
-      <w:pPr>
-        <w:spacing w:line="360" w:lineRule="auto"/>
-        <w:rPr>
-          <w:sz w:val="24"/>
-          <w:szCs w:val="24"/>
-        </w:rPr>
-      </w:pPr>
-    </w:p>
+      <w:proofErr w:type="spellStart"/>
+      <w:r>
+        <w:t>Dikau</w:t>
+      </w:r>
+      <w:bookmarkEnd w:id="13"/>
+      <w:proofErr w:type="spellEnd"/>
+    </w:p>
+    <w:p/>
+    <w:p/>
     <w:p>
       <w:pPr>
         <w:pStyle w:val="Titre2"/>
@@ -3682,169 +3230,38 @@
           <w:ilvl w:val="1"/>
           <w:numId w:val="5"/>
         </w:numPr>
-        <w:jc w:val="left"/>
       </w:pPr>
       <w:r>
         <w:t xml:space="preserve"> </w:t>
       </w:r>
-      <w:bookmarkStart w:id="13" w:name="_Toc228026232"/>
+      <w:bookmarkStart w:id="14" w:name="_Toc231220332"/>
       <w:r>
-        <w:t>Solitude du nouveau : entre syndrome de l’imposteur et rupture de     transmission</w:t>
-      </w:r>
-      <w:bookmarkEnd w:id="13"/>
-    </w:p>
-    <w:p>
-      <w:pPr>
-        <w:rPr>
-          <w:sz w:val="24"/>
-          <w:szCs w:val="24"/>
-        </w:rPr>
-      </w:pPr>
-    </w:p>
-    <w:p>
-      <w:pPr>
-        <w:pStyle w:val="Titre1"/>
-        <w:numPr>
-          <w:ilvl w:val="0"/>
-          <w:numId w:val="5"/>
-        </w:numPr>
-      </w:pPr>
-      <w:bookmarkStart w:id="14" w:name="_Toc228026233"/>
-      <w:r>
-        <w:t>Facteurs sociaux de solitudes dans les armées : les barrières invisibles</w:t>
+        <w:t>Notre modèle : « Inspection et Évaluation des Topographies Aquatiques » (IETA)</w:t>
       </w:r>
       <w:bookmarkEnd w:id="14"/>
     </w:p>
     <w:p>
       <w:pPr>
-        <w:pStyle w:val="Titre2"/>
-        <w:numPr>
-          <w:ilvl w:val="1"/>
-          <w:numId w:val="5"/>
-        </w:numPr>
-      </w:pPr>
+        <w:pStyle w:val="Titre1"/>
+      </w:pPr>
+      <w:bookmarkStart w:id="15" w:name="_Toc231220334"/>
+      <w:r>
+        <w:t>Conclusion</w:t>
+      </w:r>
+      <w:bookmarkEnd w:id="15"/>
       <w:r>
         <w:t xml:space="preserve"> </w:t>
       </w:r>
-      <w:bookmarkStart w:id="15" w:name="_Toc228026234"/>
-      <w:r>
-        <w:t>Formes de d</w:t>
-      </w:r>
-      <w:r>
-        <w:t>iscriminations</w:t>
-      </w:r>
-      <w:bookmarkEnd w:id="15"/>
-    </w:p>
-    <w:p/>
-    <w:p>
-      <w:pPr>
-        <w:pStyle w:val="Titre2"/>
-        <w:numPr>
-          <w:ilvl w:val="1"/>
-          <w:numId w:val="5"/>
-        </w:numPr>
-      </w:pPr>
-      <w:bookmarkStart w:id="16" w:name="_Toc228026235"/>
-      <w:r>
-        <w:t>Isolement fonctionnel : exemple de la relation mécanicien/pilote</w:t>
-      </w:r>
-      <w:bookmarkEnd w:id="16"/>
     </w:p>
     <w:p>
       <w:pPr>
         <w:pStyle w:val="Titre1"/>
-        <w:numPr>
-          <w:ilvl w:val="0"/>
-          <w:numId w:val="5"/>
-        </w:numPr>
-      </w:pPr>
-      <w:bookmarkStart w:id="17" w:name="_Toc228026237"/>
-      <w:r>
-        <w:t>Différents degrés de solitude</w:t>
-      </w:r>
-      <w:r>
-        <w:t> : les spécifi</w:t>
-      </w:r>
-      <w:r>
-        <w:t>ci</w:t>
-      </w:r>
-      <w:r>
-        <w:t>tés du monde militaire</w:t>
-      </w:r>
-      <w:bookmarkEnd w:id="17"/>
-    </w:p>
-    <w:p>
-      <w:pPr>
-        <w:pStyle w:val="Titre2"/>
-        <w:numPr>
-          <w:ilvl w:val="1"/>
-          <w:numId w:val="5"/>
-        </w:numPr>
-      </w:pPr>
-      <w:r>
-        <w:t xml:space="preserve"> </w:t>
-      </w:r>
-      <w:bookmarkStart w:id="18" w:name="_Toc228026238"/>
-      <w:r>
-        <w:t>La solitude du chef</w:t>
-      </w:r>
-      <w:bookmarkEnd w:id="18"/>
-    </w:p>
-    <w:p/>
-    <w:p/>
-    <w:p>
-      <w:pPr>
-        <w:pStyle w:val="Titre2"/>
-        <w:numPr>
-          <w:ilvl w:val="1"/>
-          <w:numId w:val="5"/>
-        </w:numPr>
-      </w:pPr>
-      <w:bookmarkStart w:id="19" w:name="_Toc228026239"/>
-      <w:r>
-        <w:t>L’instabilité géographique : source d’isolement familial</w:t>
-      </w:r>
-      <w:bookmarkEnd w:id="19"/>
-    </w:p>
-    <w:p/>
-    <w:p>
-      <w:pPr>
-        <w:pStyle w:val="Titre2"/>
-        <w:numPr>
-          <w:ilvl w:val="1"/>
-          <w:numId w:val="5"/>
-        </w:numPr>
-      </w:pPr>
-      <w:bookmarkStart w:id="20" w:name="_Toc228026240"/>
-      <w:r>
-        <w:lastRenderedPageBreak/>
-        <w:t>Le manque de reconnaissance de l’institution</w:t>
-      </w:r>
-      <w:bookmarkEnd w:id="20"/>
-    </w:p>
-    <w:p>
-      <w:pPr>
-        <w:pStyle w:val="Titre1"/>
-        <w:ind w:left="360"/>
-      </w:pPr>
-      <w:bookmarkStart w:id="21" w:name="_Toc228026241"/>
-      <w:r>
-        <w:t>Conclusion</w:t>
-      </w:r>
-      <w:bookmarkEnd w:id="21"/>
-      <w:r>
-        <w:t xml:space="preserve"> </w:t>
-      </w:r>
-    </w:p>
-    <w:p>
-      <w:pPr>
-        <w:pStyle w:val="Titre1"/>
-      </w:pPr>
-      <w:bookmarkStart w:id="22" w:name="_Toc228026242"/>
+      </w:pPr>
+      <w:bookmarkStart w:id="16" w:name="_Toc231220335"/>
       <w:r>
         <w:t>Bibliographie et références</w:t>
       </w:r>
-      <w:bookmarkEnd w:id="22"/>
+      <w:bookmarkEnd w:id="16"/>
     </w:p>
     <w:p/>
     <w:p/>
@@ -3854,7 +3271,7 @@
         <w:pStyle w:val="Titre1"/>
         <w:ind w:left="360"/>
       </w:pPr>
-      <w:bookmarkStart w:id="23" w:name="_Toc228026243"/>
+      <w:bookmarkStart w:id="17" w:name="_Toc231220336"/>
       <w:r>
         <w:t xml:space="preserve">Glossaire </w:t>
       </w:r>
@@ -3864,15 +3281,20 @@
       <w:r>
         <w:t>et abréviations</w:t>
       </w:r>
-      <w:bookmarkEnd w:id="23"/>
+      <w:bookmarkEnd w:id="17"/>
     </w:p>
     <w:p/>
     <w:p>
       <w:pPr>
         <w:pStyle w:val="Titre1"/>
       </w:pPr>
+      <w:bookmarkStart w:id="18" w:name="_Toc231220337"/>
       <w:r>
-        <w:t xml:space="preserve">Annexes </w:t>
+        <w:t>Annexes</w:t>
+      </w:r>
+      <w:bookmarkEnd w:id="18"/>
+      <w:r>
+        <w:t xml:space="preserve"> </w:t>
       </w:r>
     </w:p>
     <w:p/>

</xml_diff>